<commit_message>
Docs: EOM assignment for time punches and the Budget week sweep
Co-Authored-By: Claude Opus 5 <noreply@anthropic.com>
</commit_message>
<xml_diff>
--- a/docs/HR_Create_Budget_Week_Documentation.docx
+++ b/docs/HR_Create_Budget_Week_Documentation.docx
@@ -38,7 +38,7 @@
     </w:p>
     <w:p>
       <w:r>
-        <w:t xml:space="preserve">Creates the upcoming Budget week, owns the two-week Payroll periods, assigns every Budget week to its pay period, and links any time punch that has no pay period. It is the only scheduled part of the staff payroll system; fetching punches is on demand.</w:t>
+        <w:t xml:space="preserve">Creates the upcoming Budget week, owns the two-week Payroll periods, assigns every Budget week to its pay period, and links any time punch that has no pay period or no EOM (End of Month). It is the weekly scheduled part of the staff payroll system (HR Create EOM is the monthly one); fetching punches is on demand.</w:t>
       </w:r>
     </w:p>
     <w:p>
@@ -71,7 +71,7 @@
     </w:p>
     <w:p>
       <w:r>
-        <w:t xml:space="preserve">- Links any time punch without a pay period to the existing period covering its date.</w:t>
+        <w:t xml:space="preserve">- Links any time punch without a pay period, or without an EOM, to the existing period / EOM covering its date.</w:t>
       </w:r>
     </w:p>
     <w:p>
@@ -131,6 +131,11 @@
       </w:r>
     </w:p>
     <w:p>
+      <w:r>
+        <w:t xml:space="preserve">EOM: the same sweep links punches with no EOM to the existing EOM covering their date. It never creates an EOM — HR Create EOM does that on the 15th — and punches dated before the first EOM are ignored. A punch whose date has no EOM, or two, is listed and fails the run.</w:t>
+      </w:r>
+    </w:p>
+    <w:p>
       <w:pPr>
         <w:pStyle w:val="Heading2"/>
       </w:pPr>
@@ -140,7 +145,7 @@
     </w:p>
     <w:p>
       <w:r>
-        <w:t xml:space="preserve">Airtable only; no MTEK calls. Reads Payroll period, Budget week and Time Punches; creates Budget week and Payroll period records; updates Budget week and Time Punches links in batches of 10.</w:t>
+        <w:t xml:space="preserve">Airtable only; no MTEK calls. Reads Payroll period, EOM, Budget week and Time Punches; creates Budget week and Payroll period records; updates Budget week and Time Punches links (period and EOM together, one update per punch) in batches of 10.</w:t>
       </w:r>
     </w:p>
     <w:p>
@@ -163,7 +168,7 @@
     </w:p>
     <w:p>
       <w:r>
-        <w:t xml:space="preserve">- AIRTABLE_BASE_ID (appiwfeujJzUZPPBx), AIRTABLE_BUDGET_WEEKS_TABLE_ID (tblt2pfs356rDVDIa), AIRTABLE_PAYROLL_PERIODS_TABLE_ID (tbl9qw4kqw0BY0DyJ), AIRTABLE_PUNCHES_TABLE_ID (tblVxt2W7NanQmJFR), PAYROLL_TIME_ZONE (America/Toronto)</w:t>
+        <w:t xml:space="preserve">- AIRTABLE_BASE_ID (appiwfeujJzUZPPBx), AIRTABLE_BUDGET_WEEKS_TABLE_ID (tblt2pfs356rDVDIa), AIRTABLE_PAYROLL_PERIODS_TABLE_ID (tbl9qw4kqw0BY0DyJ), AIRTABLE_EOM_TABLE_ID (tbl3UMRShm59z41JL), AIRTABLE_PUNCHES_TABLE_ID (tblVxt2W7NanQmJFR), PAYROLL_TIME_ZONE (America/Toronto)</w:t>
       </w:r>
     </w:p>
     <w:p>
@@ -247,7 +252,12 @@
     </w:p>
     <w:p>
       <w:r>
-        <w:t xml:space="preserve">Time Punches (tblVxt2W7NanQmJFR): the Payroll period link, filled at import and swept by this job.</w:t>
+        <w:t xml:space="preserve">Time Punches (tblVxt2W7NanQmJFR): the Payroll period and EOM links, filled at import and swept by this job.</w:t>
+      </w:r>
+    </w:p>
+    <w:p>
+      <w:r>
+        <w:t xml:space="preserve">EOM (tbl3UMRShm59z41JL): Start Date and End Date are read only; records are created by HR Create EOM.</w:t>
       </w:r>
     </w:p>
     <w:p>
@@ -298,6 +308,11 @@
     </w:p>
     <w:p>
       <w:r>
+        <w:t xml:space="preserve">- "no EOM covers it" for a time punch: its month has no EOM. Run HR Create EOM, then re-run this job.</w:t>
+      </w:r>
+    </w:p>
+    <w:p>
+      <w:r>
         <w:t xml:space="preserve">- No new week on Monday: check Actions history; GitHub occasionally skips scheduled runs. Re-run it manually.</w:t>
       </w:r>
     </w:p>
@@ -327,6 +342,11 @@
     <w:p>
       <w:r>
         <w:t xml:space="preserve">Before the merge, the standalone job created the first two follow-on periods and linked all 295 existing time punches to the reference period, confirmed independently with zero punches left unassigned.</w:t>
+      </w:r>
+    </w:p>
+    <w:p>
+      <w:r>
+        <w:t xml:space="preserve">2026-09-17, first run with the EOM sweep (manual): the coming week already existed, no period or week needed changing, and 479 time punches were linked to their EOM, leaving none since 2026-08-01 without one.</w:t>
       </w:r>
     </w:p>
     <w:p>

</xml_diff>